<commit_message>
Production deployment and configuration updates
</commit_message>
<xml_diff>
--- a/Accessible Content Preflight Suite Project.docx
+++ b/Accessible Content Preflight Suite Project.docx
@@ -9458,6 +9458,385 @@
         <w:t xml:space="preserve"> karwao.</w:t>
       </w:r>
     </w:p>
+    <w:p/>
+    <w:p/>
+    <w:p>
+      <w:pPr>
+        <w:rPr>
+          <w:b/>
+          <w:bCs/>
+        </w:rPr>
+      </w:pPr>
+      <w:r>
+        <w:rPr>
+          <w:b/>
+          <w:bCs/>
+        </w:rPr>
+        <w:t>Inme se kaunsi values aapko khud obtain/generate karni hain</w:t>
+      </w:r>
+    </w:p>
+    <w:p>
+      <w:r>
+        <w:t>Ye values main invent nahi kar sakta, because ye aapke private credentials hain:</w:t>
+      </w:r>
+    </w:p>
+    <w:tbl>
+      <w:tblPr>
+        <w:tblW w:w="0" w:type="auto"/>
+        <w:tblCellSpacing w:w="15" w:type="dxa"/>
+        <w:tblCellMar>
+          <w:top w:w="15" w:type="dxa"/>
+          <w:left w:w="15" w:type="dxa"/>
+          <w:bottom w:w="15" w:type="dxa"/>
+          <w:right w:w="15" w:type="dxa"/>
+        </w:tblCellMar>
+        <w:tblLook w:val="04A0" w:firstRow="1" w:lastRow="0" w:firstColumn="1" w:lastColumn="0" w:noHBand="0" w:noVBand="1"/>
+      </w:tblPr>
+      <w:tblGrid>
+        <w:gridCol w:w="3945"/>
+        <w:gridCol w:w="3949"/>
+      </w:tblGrid>
+      <w:tr>
+        <w:trPr>
+          <w:tblHeader/>
+          <w:tblCellSpacing w:w="15" w:type="dxa"/>
+        </w:trPr>
+        <w:tc>
+          <w:tcPr>
+            <w:tcW w:w="0" w:type="auto"/>
+            <w:vAlign w:val="center"/>
+            <w:hideMark/>
+          </w:tcPr>
+          <w:p>
+            <w:pPr>
+              <w:rPr>
+                <w:b/>
+                <w:bCs/>
+              </w:rPr>
+            </w:pPr>
+            <w:r>
+              <w:rPr>
+                <w:b/>
+                <w:bCs/>
+              </w:rPr>
+              <w:t>Variable</w:t>
+            </w:r>
+          </w:p>
+        </w:tc>
+        <w:tc>
+          <w:tcPr>
+            <w:tcW w:w="0" w:type="auto"/>
+            <w:vAlign w:val="center"/>
+            <w:hideMark/>
+          </w:tcPr>
+          <w:p>
+            <w:pPr>
+              <w:rPr>
+                <w:b/>
+                <w:bCs/>
+              </w:rPr>
+            </w:pPr>
+            <w:r>
+              <w:rPr>
+                <w:b/>
+                <w:bCs/>
+              </w:rPr>
+              <w:t>Kahan se milega / kya karna hai</w:t>
+            </w:r>
+          </w:p>
+        </w:tc>
+      </w:tr>
+      <w:tr>
+        <w:trPr>
+          <w:tblCellSpacing w:w="15" w:type="dxa"/>
+        </w:trPr>
+        <w:tc>
+          <w:tcPr>
+            <w:tcW w:w="0" w:type="auto"/>
+            <w:vAlign w:val="center"/>
+            <w:hideMark/>
+          </w:tcPr>
+          <w:p>
+            <w:r>
+              <w:t>MONGODB_URI</w:t>
+            </w:r>
+          </w:p>
+        </w:tc>
+        <w:tc>
+          <w:tcPr>
+            <w:tcW w:w="0" w:type="auto"/>
+            <w:vAlign w:val="center"/>
+            <w:hideMark/>
+          </w:tcPr>
+          <w:p>
+            <w:r>
+              <w:t>MongoDB Atlas</w:t>
+            </w:r>
+          </w:p>
+        </w:tc>
+      </w:tr>
+      <w:tr>
+        <w:trPr>
+          <w:tblCellSpacing w:w="15" w:type="dxa"/>
+        </w:trPr>
+        <w:tc>
+          <w:tcPr>
+            <w:tcW w:w="0" w:type="auto"/>
+            <w:vAlign w:val="center"/>
+            <w:hideMark/>
+          </w:tcPr>
+          <w:p>
+            <w:r>
+              <w:t>OPENAI_API_KEY</w:t>
+            </w:r>
+          </w:p>
+        </w:tc>
+        <w:tc>
+          <w:tcPr>
+            <w:tcW w:w="0" w:type="auto"/>
+            <w:vAlign w:val="center"/>
+            <w:hideMark/>
+          </w:tcPr>
+          <w:p>
+            <w:r>
+              <w:t>OpenAI API account</w:t>
+            </w:r>
+          </w:p>
+        </w:tc>
+      </w:tr>
+      <w:tr>
+        <w:trPr>
+          <w:tblCellSpacing w:w="15" w:type="dxa"/>
+        </w:trPr>
+        <w:tc>
+          <w:tcPr>
+            <w:tcW w:w="0" w:type="auto"/>
+            <w:vAlign w:val="center"/>
+            <w:hideMark/>
+          </w:tcPr>
+          <w:p>
+            <w:r>
+              <w:t>BLOB_READ_WRITE_TOKEN</w:t>
+            </w:r>
+          </w:p>
+        </w:tc>
+        <w:tc>
+          <w:tcPr>
+            <w:tcW w:w="0" w:type="auto"/>
+            <w:vAlign w:val="center"/>
+            <w:hideMark/>
+          </w:tcPr>
+          <w:p>
+            <w:r>
+              <w:t>Vercel Blob</w:t>
+            </w:r>
+          </w:p>
+        </w:tc>
+      </w:tr>
+      <w:tr>
+        <w:trPr>
+          <w:tblCellSpacing w:w="15" w:type="dxa"/>
+        </w:trPr>
+        <w:tc>
+          <w:tcPr>
+            <w:tcW w:w="0" w:type="auto"/>
+            <w:vAlign w:val="center"/>
+            <w:hideMark/>
+          </w:tcPr>
+          <w:p>
+            <w:r>
+              <w:t>CRON_SECRET</w:t>
+            </w:r>
+          </w:p>
+        </w:tc>
+        <w:tc>
+          <w:tcPr>
+            <w:tcW w:w="0" w:type="auto"/>
+            <w:vAlign w:val="center"/>
+            <w:hideMark/>
+          </w:tcPr>
+          <w:p>
+            <w:r>
+              <w:t>Random strong secret generate karo</w:t>
+            </w:r>
+          </w:p>
+        </w:tc>
+      </w:tr>
+      <w:tr>
+        <w:trPr>
+          <w:tblCellSpacing w:w="15" w:type="dxa"/>
+        </w:trPr>
+        <w:tc>
+          <w:tcPr>
+            <w:tcW w:w="0" w:type="auto"/>
+            <w:vAlign w:val="center"/>
+            <w:hideMark/>
+          </w:tcPr>
+          <w:p>
+            <w:r>
+              <w:t>VISUAL_LOCATOR_SIGNING_SECRET</w:t>
+            </w:r>
+          </w:p>
+        </w:tc>
+        <w:tc>
+          <w:tcPr>
+            <w:tcW w:w="0" w:type="auto"/>
+            <w:vAlign w:val="center"/>
+            <w:hideMark/>
+          </w:tcPr>
+          <w:p>
+            <w:r>
+              <w:t>Separate random strong secret</w:t>
+            </w:r>
+          </w:p>
+        </w:tc>
+      </w:tr>
+      <w:tr>
+        <w:trPr>
+          <w:tblCellSpacing w:w="15" w:type="dxa"/>
+        </w:trPr>
+        <w:tc>
+          <w:tcPr>
+            <w:tcW w:w="0" w:type="auto"/>
+            <w:vAlign w:val="center"/>
+            <w:hideMark/>
+          </w:tcPr>
+          <w:p>
+            <w:r>
+              <w:t>GOOGLE_SITE_VERIFICATION</w:t>
+            </w:r>
+          </w:p>
+        </w:tc>
+        <w:tc>
+          <w:tcPr>
+            <w:tcW w:w="0" w:type="auto"/>
+            <w:vAlign w:val="center"/>
+            <w:hideMark/>
+          </w:tcPr>
+          <w:p>
+            <w:r>
+              <w:t>Google Search Console later</w:t>
+            </w:r>
+          </w:p>
+        </w:tc>
+      </w:tr>
+      <w:tr>
+        <w:trPr>
+          <w:tblCellSpacing w:w="15" w:type="dxa"/>
+        </w:trPr>
+        <w:tc>
+          <w:tcPr>
+            <w:tcW w:w="0" w:type="auto"/>
+            <w:vAlign w:val="center"/>
+            <w:hideMark/>
+          </w:tcPr>
+          <w:p>
+            <w:r>
+              <w:t>BING_SITE_VERIFICATION</w:t>
+            </w:r>
+          </w:p>
+        </w:tc>
+        <w:tc>
+          <w:tcPr>
+            <w:tcW w:w="0" w:type="auto"/>
+            <w:vAlign w:val="center"/>
+            <w:hideMark/>
+          </w:tcPr>
+          <w:p>
+            <w:r>
+              <w:t>Bing Webmaster Tools later</w:t>
+            </w:r>
+          </w:p>
+        </w:tc>
+      </w:tr>
+      <w:tr>
+        <w:trPr>
+          <w:tblCellSpacing w:w="15" w:type="dxa"/>
+        </w:trPr>
+        <w:tc>
+          <w:tcPr>
+            <w:tcW w:w="0" w:type="auto"/>
+            <w:vAlign w:val="center"/>
+            <w:hideMark/>
+          </w:tcPr>
+          <w:p>
+            <w:r>
+              <w:t>INDEXNOW_KEY</w:t>
+            </w:r>
+          </w:p>
+        </w:tc>
+        <w:tc>
+          <w:tcPr>
+            <w:tcW w:w="0" w:type="auto"/>
+            <w:vAlign w:val="center"/>
+            <w:hideMark/>
+          </w:tcPr>
+          <w:p>
+            <w:r>
+              <w:t>IndexNow setup later</w:t>
+            </w:r>
+          </w:p>
+        </w:tc>
+      </w:tr>
+      <w:tr>
+        <w:trPr>
+          <w:tblCellSpacing w:w="15" w:type="dxa"/>
+        </w:trPr>
+        <w:tc>
+          <w:tcPr>
+            <w:tcW w:w="0" w:type="auto"/>
+            <w:vAlign w:val="center"/>
+            <w:hideMark/>
+          </w:tcPr>
+          <w:p>
+            <w:r>
+              <w:t>SCANNER_SERVICE_URL</w:t>
+            </w:r>
+          </w:p>
+        </w:tc>
+        <w:tc>
+          <w:tcPr>
+            <w:tcW w:w="0" w:type="auto"/>
+            <w:vAlign w:val="center"/>
+            <w:hideMark/>
+          </w:tcPr>
+          <w:p>
+            <w:r>
+              <w:t>Remote scanner deploy hone ke baad</w:t>
+            </w:r>
+          </w:p>
+        </w:tc>
+      </w:tr>
+      <w:tr>
+        <w:trPr>
+          <w:tblCellSpacing w:w="15" w:type="dxa"/>
+        </w:trPr>
+        <w:tc>
+          <w:tcPr>
+            <w:tcW w:w="0" w:type="auto"/>
+            <w:vAlign w:val="center"/>
+            <w:hideMark/>
+          </w:tcPr>
+          <w:p>
+            <w:r>
+              <w:t>SCANNER_SERVICE_TOKEN</w:t>
+            </w:r>
+          </w:p>
+        </w:tc>
+        <w:tc>
+          <w:tcPr>
+            <w:tcW w:w="0" w:type="auto"/>
+            <w:vAlign w:val="center"/>
+            <w:hideMark/>
+          </w:tcPr>
+          <w:p>
+            <w:r>
+              <w:t>Remote scanner worker secret</w:t>
+            </w:r>
+          </w:p>
+        </w:tc>
+      </w:tr>
+    </w:tbl>
     <w:p/>
     <w:p/>
     <w:p/>

</xml_diff>